<commit_message>
docs: record core phase state (T-16)
</commit_message>
<xml_diff>
--- a/deliverables/adr/0001-order-pricing-and-confirmation.docx
+++ b/deliverables/adr/0001-order-pricing-and-confirmation.docx
@@ -35,8 +35,8 @@
       <w:tblGrid>
         <w:gridCol w:w="1354"/>
         <w:gridCol w:w="1622"/>
-        <w:gridCol w:w="1915"/>
-        <w:gridCol w:w="4746"/>
+        <w:gridCol w:w="2583"/>
+        <w:gridCol w:w="4079"/>
       </w:tblGrid>
       <w:tr>
         <w:tc>
@@ -79,7 +79,7 @@
         </w:tc>
         <w:tc>
           <w:tcPr>
-            <w:tcW w:type="dxa" w:w="1915"/>
+            <w:tcW w:type="dxa" w:w="2583"/>
           </w:tcPr>
           <w:p>
             <w:pPr>
@@ -98,7 +98,7 @@
         </w:tc>
         <w:tc>
           <w:tcPr>
-            <w:tcW w:type="dxa" w:w="4746"/>
+            <w:tcW w:type="dxa" w:w="4079"/>
           </w:tcPr>
           <w:p>
             <w:pPr>
@@ -132,7 +132,7 @@
                 <w:color w:val="000000"/>
                 <w:sz w:val="24"/>
               </w:rPr>
-              <w:t>proposed</w:t>
+              <w:t>accepted</w:t>
             </w:r>
           </w:p>
         </w:tc>
@@ -151,13 +151,13 @@
                 <w:color w:val="000000"/>
                 <w:sz w:val="24"/>
               </w:rPr>
-              <w:t>2026-10-14</w:t>
+              <w:t>2026-10-15</w:t>
             </w:r>
           </w:p>
         </w:tc>
         <w:tc>
           <w:tcPr>
-            <w:tcW w:type="dxa" w:w="1915"/>
+            <w:tcW w:type="dxa" w:w="2583"/>
           </w:tcPr>
           <w:p>
             <w:pPr>
@@ -176,7 +176,7 @@
         </w:tc>
         <w:tc>
           <w:tcPr>
-            <w:tcW w:type="dxa" w:w="4746"/>
+            <w:tcW w:type="dxa" w:w="4079"/>
           </w:tcPr>
           <w:p>
             <w:pPr>
@@ -189,7 +189,7 @@
                 <w:color w:val="000000"/>
                 <w:sz w:val="24"/>
               </w:rPr>
-              <w:t>High. Medium on gift tax (depends on the country)</w:t>
+              <w:t>High. Medium on gift tax</w:t>
             </w:r>
           </w:p>
         </w:tc>
@@ -206,7 +206,7 @@
           <w:color w:val="000000"/>
           <w:sz w:val="24"/>
         </w:rPr>
-        <w:t>Confirmed orders went missing in three releases. We must guarantee confirmed total = quoted total, exact money, that a 201 is a stored order, and that its effects reach push and the ERP.</w:t>
+        <w:t>Confirmed orders went missing in three releases. We must guarantee confirmed total = quoted total, exact money, that a 201 is a stored order, and that effects on push and the ERP are never lost or applied twice.</w:t>
       </w:r>
     </w:p>
     <w:p>
@@ -240,14 +240,14 @@
         </w:tblBorders>
       </w:tblPr>
       <w:tblGrid>
-        <w:gridCol w:w="3893"/>
-        <w:gridCol w:w="3016"/>
-        <w:gridCol w:w="2729"/>
+        <w:gridCol w:w="3512"/>
+        <w:gridCol w:w="3164"/>
+        <w:gridCol w:w="2962"/>
       </w:tblGrid>
       <w:tr>
         <w:tc>
           <w:tcPr>
-            <w:tcW w:type="dxa" w:w="3893"/>
+            <w:tcW w:type="dxa" w:w="3512"/>
           </w:tcPr>
           <w:p>
             <w:pPr>
@@ -266,7 +266,7 @@
         </w:tc>
         <w:tc>
           <w:tcPr>
-            <w:tcW w:type="dxa" w:w="3016"/>
+            <w:tcW w:type="dxa" w:w="3164"/>
           </w:tcPr>
           <w:p>
             <w:pPr>
@@ -285,7 +285,7 @@
         </w:tc>
         <w:tc>
           <w:tcPr>
-            <w:tcW w:type="dxa" w:w="2729"/>
+            <w:tcW w:type="dxa" w:w="2962"/>
           </w:tcPr>
           <w:p>
             <w:pPr>
@@ -306,7 +306,7 @@
       <w:tr>
         <w:tc>
           <w:tcPr>
-            <w:tcW w:type="dxa" w:w="3893"/>
+            <w:tcW w:type="dxa" w:w="3512"/>
           </w:tcPr>
           <w:p>
             <w:pPr>
@@ -319,13 +319,13 @@
                 <w:color w:val="000000"/>
                 <w:sz w:val="24"/>
               </w:rPr>
-              <w:t>Insert-only quote lines. The order references them, with no amounts</w:t>
+              <w:t>Sealed, insert-only quote. The order references it, with no amounts</w:t>
             </w:r>
           </w:p>
         </w:tc>
         <w:tc>
           <w:tcPr>
-            <w:tcW w:type="dxa" w:w="3016"/>
+            <w:tcW w:type="dxa" w:w="3164"/>
           </w:tcPr>
           <w:p>
             <w:pPr>
@@ -338,13 +338,13 @@
                 <w:color w:val="000000"/>
                 <w:sz w:val="24"/>
               </w:rPr>
-              <w:t>Copying the breakdown. Recomputing at confirmation</w:t>
+              <w:t>Copying the breakdown. Recomputing on confirm</w:t>
             </w:r>
           </w:p>
         </w:tc>
         <w:tc>
           <w:tcPr>
-            <w:tcW w:type="dxa" w:w="2729"/>
+            <w:tcW w:type="dxa" w:w="2962"/>
           </w:tcPr>
           <w:p>
             <w:pPr>
@@ -357,7 +357,7 @@
                 <w:color w:val="000000"/>
                 <w:sz w:val="24"/>
               </w:rPr>
-              <w:t>Two copies diverge. Recomputing changes with prices</w:t>
+              <w:t>Copies diverge. Prices change</w:t>
             </w:r>
           </w:p>
         </w:tc>
@@ -365,7 +365,7 @@
       <w:tr>
         <w:tc>
           <w:tcPr>
-            <w:tcW w:type="dxa" w:w="3893"/>
+            <w:tcW w:type="dxa" w:w="3512"/>
           </w:tcPr>
           <w:p>
             <w:pPr>
@@ -387,13 +387,13 @@
                 <w:color w:val="000000"/>
                 <w:sz w:val="24"/>
               </w:rPr>
-              <w:t xml:space="preserve"> per line. Combos, then tiers, then tax</w:t>
+              <w:t xml:space="preserve"> rounded per line, totals never re-rounded. Combos before tiers</w:t>
             </w:r>
           </w:p>
         </w:tc>
         <w:tc>
           <w:tcPr>
-            <w:tcW w:type="dxa" w:w="3016"/>
+            <w:tcW w:type="dxa" w:w="3164"/>
           </w:tcPr>
           <w:p>
             <w:pPr>
@@ -415,13 +415,13 @@
                 <w:color w:val="000000"/>
                 <w:sz w:val="24"/>
               </w:rPr>
-              <w:t>. Rounding the total. Tiers first</w:t>
+              <w:t xml:space="preserve"> minor units. Rounding the total. Tiers first</w:t>
             </w:r>
           </w:p>
         </w:tc>
         <w:tc>
           <w:tcPr>
-            <w:tcW w:type="dxa" w:w="2729"/>
+            <w:tcW w:type="dxa" w:w="2962"/>
           </w:tcPr>
           <w:p>
             <w:pPr>
@@ -434,7 +434,7 @@
                 <w:color w:val="000000"/>
                 <w:sz w:val="24"/>
               </w:rPr>
-              <w:t>Hides cents. Double discount on the combo</w:t>
+              <w:t>Awkward with tax rates. Invoice mismatch. Double discount</w:t>
             </w:r>
           </w:p>
         </w:tc>
@@ -442,7 +442,7 @@
       <w:tr>
         <w:tc>
           <w:tcPr>
-            <w:tcW w:type="dxa" w:w="3893"/>
+            <w:tcW w:type="dxa" w:w="3512"/>
           </w:tcPr>
           <w:p>
             <w:pPr>
@@ -455,7 +455,66 @@
                 <w:color w:val="000000"/>
                 <w:sz w:val="24"/>
               </w:rPr>
-              <w:t xml:space="preserve">One PostgreSQL transaction: key → quote → credit → order → outbox; 201 after commit. Outbox with a lease and </w:t>
+              <w:t>One PostgreSQL ACID transaction, locks key → quote → credit. The 201 after commit</w:t>
+            </w:r>
+          </w:p>
+        </w:tc>
+        <w:tc>
+          <w:tcPr>
+            <w:tcW w:type="dxa" w:w="3164"/>
+          </w:tcPr>
+          <w:p>
+            <w:pPr>
+              <w:spacing w:after="0"/>
+            </w:pPr>
+            <w:r>
+              <w:rPr>
+                <w:rFonts w:ascii="Arial" w:hAnsi="Arial" w:eastAsia="Arial"/>
+                <w:b w:val="0"/>
+                <w:color w:val="000000"/>
+                <w:sz w:val="24"/>
+              </w:rPr>
+              <w:t>In-memory store. Asynchronous write or saga. Keys in a cache</w:t>
+            </w:r>
+          </w:p>
+        </w:tc>
+        <w:tc>
+          <w:tcPr>
+            <w:tcW w:type="dxa" w:w="2962"/>
+          </w:tcPr>
+          <w:p>
+            <w:pPr>
+              <w:spacing w:after="0"/>
+            </w:pPr>
+            <w:r>
+              <w:rPr>
+                <w:rFonts w:ascii="Arial" w:hAnsi="Arial" w:eastAsia="Arial"/>
+                <w:b w:val="0"/>
+                <w:color w:val="000000"/>
+                <w:sz w:val="24"/>
+              </w:rPr>
+              <w:t>No real locks. The "confirmed but missing" defect. Not atomic</w:t>
+            </w:r>
+          </w:p>
+        </w:tc>
+      </w:tr>
+      <w:tr>
+        <w:tc>
+          <w:tcPr>
+            <w:tcW w:type="dxa" w:w="3512"/>
+          </w:tcPr>
+          <w:p>
+            <w:pPr>
+              <w:spacing w:after="0"/>
+            </w:pPr>
+            <w:r>
+              <w:rPr>
+                <w:rFonts w:ascii="Arial" w:hAnsi="Arial" w:eastAsia="Arial"/>
+                <w:b w:val="0"/>
+                <w:color w:val="000000"/>
+                <w:sz w:val="24"/>
+              </w:rPr>
+              <w:t xml:space="preserve">Transactional outbox with lease and backoff. Push and ERP deduplicate by </w:t>
             </w:r>
             <w:r>
               <w:rPr>
@@ -470,7 +529,7 @@
         </w:tc>
         <w:tc>
           <w:tcPr>
-            <w:tcW w:type="dxa" w:w="3016"/>
+            <w:tcW w:type="dxa" w:w="3164"/>
           </w:tcPr>
           <w:p>
             <w:pPr>
@@ -483,13 +542,13 @@
                 <w:color w:val="000000"/>
                 <w:sz w:val="24"/>
               </w:rPr>
-              <w:t>Asynchronous write or saga. Publishing after commit. Memory</w:t>
+              <w:t>Publishing after commit. Two-phase commit</w:t>
             </w:r>
           </w:p>
         </w:tc>
         <w:tc>
           <w:tcPr>
-            <w:tcW w:type="dxa" w:w="2729"/>
+            <w:tcW w:type="dxa" w:w="2962"/>
           </w:tcPr>
           <w:p>
             <w:pPr>
@@ -502,7 +561,7 @@
                 <w:color w:val="000000"/>
                 <w:sz w:val="24"/>
               </w:rPr>
-              <w:t>The "confirmed but missing" defect. Lost events. No real locks</w:t>
+              <w:t>Lost events. Push and ERP cannot join it</w:t>
             </w:r>
           </w:p>
         </w:tc>
@@ -510,7 +569,7 @@
       <w:tr>
         <w:tc>
           <w:tcPr>
-            <w:tcW w:type="dxa" w:w="3893"/>
+            <w:tcW w:type="dxa" w:w="3512"/>
           </w:tcPr>
           <w:p>
             <w:pPr>
@@ -523,13 +582,13 @@
                 <w:color w:val="000000"/>
                 <w:sz w:val="24"/>
               </w:rPr>
-              <w:t>Hexagonal monolith, separate repositories (API, docs, web, infra, tools)</w:t>
+              <w:t>Hexagonal monolith, explicit SQL, separate repositories</w:t>
             </w:r>
           </w:p>
         </w:tc>
         <w:tc>
           <w:tcPr>
-            <w:tcW w:type="dxa" w:w="3016"/>
+            <w:tcW w:type="dxa" w:w="3164"/>
           </w:tcPr>
           <w:p>
             <w:pPr>
@@ -542,13 +601,13 @@
                 <w:color w:val="000000"/>
                 <w:sz w:val="24"/>
               </w:rPr>
-              <w:t>Microservices. Monorepo</w:t>
+              <w:t>Microservices. JPA. Monorepo</w:t>
             </w:r>
           </w:p>
         </w:tc>
         <w:tc>
           <w:tcPr>
-            <w:tcW w:type="dxa" w:w="2729"/>
+            <w:tcW w:type="dxa" w:w="2962"/>
           </w:tcPr>
           <w:p>
             <w:pPr>
@@ -561,7 +620,7 @@
                 <w:color w:val="000000"/>
                 <w:sz w:val="24"/>
               </w:rPr>
-              <w:t>One transaction covers the write. Each component evolves apart</w:t>
+              <w:t>One transaction. JPA hides locks. Components evolve apart</w:t>
             </w:r>
           </w:p>
         </w:tc>
@@ -603,31 +662,7 @@
           <w:color w:val="000000"/>
           <w:sz w:val="24"/>
         </w:rPr>
-        <w:t xml:space="preserve"> out of scope. A gateway would inject the tenant and customer.</w:t>
-      </w:r>
-    </w:p>
-    <w:p>
-      <w:pPr>
-        <w:pStyle w:val="ListBullet"/>
-        <w:spacing w:after="40"/>
-      </w:pPr>
-      <w:r>
-        <w:rPr>
-          <w:rFonts w:ascii="Arial" w:hAnsi="Arial" w:eastAsia="Arial"/>
-          <w:b/>
-          <w:color w:val="000000"/>
-          <w:sz w:val="24"/>
-        </w:rPr>
-        <w:t>Revocation, cancellation and credit release:</w:t>
-      </w:r>
-      <w:r>
-        <w:rPr>
-          <w:rFonts w:ascii="Arial" w:hAnsi="Arial" w:eastAsia="Arial"/>
-          <w:b w:val="0"/>
-          <w:color w:val="000000"/>
-          <w:sz w:val="24"/>
-        </w:rPr>
-        <w:t xml:space="preserve"> not asked for. Revocation is the mitigation.</w:t>
+        <w:t xml:space="preserve"> out of scope. A gateway would inject tenant and customer.</w:t>
       </w:r>
     </w:p>
     <w:p>
@@ -651,7 +686,7 @@
           <w:color w:val="000000"/>
           <w:sz w:val="24"/>
         </w:rPr>
-        <w:t xml:space="preserve"> fakes behind ports already prove the guarantees.</w:t>
+        <w:t xml:space="preserve"> fakes behind ports prove the guarantees.</w:t>
       </w:r>
     </w:p>
     <w:p>
@@ -666,7 +701,7 @@
           <w:color w:val="000000"/>
           <w:sz w:val="24"/>
         </w:rPr>
-        <w:t>Catalog, tax categories, price history, OpenAPI and deployment:</w:t>
+        <w:t>Not asked for:</w:t>
       </w:r>
       <w:r>
         <w:rPr>
@@ -675,7 +710,7 @@
           <w:color w:val="000000"/>
           <w:sz w:val="24"/>
         </w:rPr>
-        <w:t xml:space="preserve"> not asked for.</w:t>
+        <w:t xml:space="preserve"> revocation (the risk mitigation), cancellation, credit release, catalog, tax categories, price history, OpenAPI, deployment, CI and SonarQube (README).</w:t>
       </w:r>
     </w:p>
     <w:p>
@@ -741,7 +776,7 @@
           <w:color w:val="000000"/>
           <w:sz w:val="24"/>
         </w:rPr>
-        <w:t xml:space="preserve">. Money is compared with </w:t>
+        <w:t xml:space="preserve">. Money compared with </w:t>
       </w:r>
       <w:r>
         <w:rPr>
@@ -759,7 +794,7 @@
           <w:color w:val="000000"/>
           <w:sz w:val="24"/>
         </w:rPr>
-        <w:t>.</w:t>
+        <w:t>. No UPDATE on quotes.</w:t>
       </w:r>
     </w:p>
     <w:p>
@@ -799,6 +834,21 @@
           <w:sz w:val="24"/>
         </w:rPr>
         <w:t>Locks key → quote → credit. The 201 after commit. No cached failure.</w:t>
+      </w:r>
+    </w:p>
+    <w:p>
+      <w:pPr>
+        <w:pStyle w:val="ListBullet"/>
+        <w:spacing w:after="40"/>
+      </w:pPr>
+      <w:r>
+        <w:rPr>
+          <w:rFonts w:ascii="Arial" w:hAnsi="Arial" w:eastAsia="Arial"/>
+          <w:b w:val="0"/>
+          <w:color w:val="000000"/>
+          <w:sz w:val="24"/>
+        </w:rPr>
+        <w:t>The relay sends outside any transaction. Only the lease holder marks the outcome.</w:t>
       </w:r>
     </w:p>
     <w:p>
@@ -866,7 +916,7 @@
           <w:color w:val="000000"/>
           <w:sz w:val="24"/>
         </w:rPr>
-        <w:t xml:space="preserve"> a 15-minute TTL; then revocation (OPEN → REVOKED, 409). </w:t>
+        <w:t xml:space="preserve"> a 15-minute TTL per country; then revocation (OPEN → REVOKED, 409). </w:t>
       </w:r>
       <w:r>
         <w:rPr>

</xml_diff>

<commit_message>
docs: add delivery documents and public page (T-21)
</commit_message>
<xml_diff>
--- a/deliverables/adr/0001-order-pricing-and-confirmation.docx
+++ b/deliverables/adr/0001-order-pricing-and-confirmation.docx
@@ -4,6 +4,7 @@
   <w:body>
     <w:p>
       <w:pPr>
+        <w:pStyle w:val="Heading1"/>
         <w:keepNext/>
         <w:spacing w:before="0" w:after="80"/>
       </w:pPr>
@@ -211,6 +212,7 @@
     </w:p>
     <w:p>
       <w:pPr>
+        <w:pStyle w:val="Heading2"/>
         <w:keepNext/>
         <w:spacing w:before="160" w:after="80"/>
       </w:pPr>
@@ -628,6 +630,7 @@
     </w:tbl>
     <w:p>
       <w:pPr>
+        <w:pStyle w:val="Heading2"/>
         <w:keepNext/>
         <w:spacing w:before="160" w:after="80"/>
       </w:pPr>
@@ -715,6 +718,7 @@
     </w:p>
     <w:p>
       <w:pPr>
+        <w:pStyle w:val="Heading2"/>
         <w:keepNext/>
         <w:spacing w:before="160" w:after="80"/>
       </w:pPr>
@@ -868,6 +872,7 @@
     </w:p>
     <w:p>
       <w:pPr>
+        <w:pStyle w:val="Heading2"/>
         <w:keepNext/>
         <w:spacing w:before="160" w:after="80"/>
       </w:pPr>
@@ -1410,11 +1415,12 @@
       <w:outlineLvl w:val="0"/>
     </w:pPr>
     <w:rPr>
-      <w:rFonts w:asciiTheme="majorHAnsi" w:eastAsiaTheme="majorEastAsia" w:hAnsiTheme="majorHAnsi" w:cstheme="majorBidi"/>
+      <w:rFonts w:ascii="Arial" w:hAnsi="Arial"/>
       <w:b/>
       <w:bCs/>
-      <w:color w:val="365F91" w:themeColor="accent1" w:themeShade="BF"/>
-      <w:sz w:val="28"/>
+      <w:i w:val="0"/>
+      <w:color w:val="000000"/>
+      <w:sz w:val="24"/>
       <w:szCs w:val="28"/>
     </w:rPr>
   </w:style>
@@ -1434,11 +1440,12 @@
       <w:outlineLvl w:val="1"/>
     </w:pPr>
     <w:rPr>
-      <w:rFonts w:asciiTheme="majorHAnsi" w:eastAsiaTheme="majorEastAsia" w:hAnsiTheme="majorHAnsi" w:cstheme="majorBidi"/>
+      <w:rFonts w:ascii="Arial" w:hAnsi="Arial"/>
       <w:b/>
       <w:bCs/>
-      <w:color w:val="4F81BD" w:themeColor="accent1"/>
-      <w:sz w:val="26"/>
+      <w:i w:val="0"/>
+      <w:color w:val="000000"/>
+      <w:sz w:val="24"/>
       <w:szCs w:val="26"/>
     </w:rPr>
   </w:style>
@@ -1458,10 +1465,12 @@
       <w:outlineLvl w:val="2"/>
     </w:pPr>
     <w:rPr>
-      <w:rFonts w:asciiTheme="majorHAnsi" w:eastAsiaTheme="majorEastAsia" w:hAnsiTheme="majorHAnsi" w:cstheme="majorBidi"/>
+      <w:rFonts w:ascii="Arial" w:hAnsi="Arial"/>
       <w:b/>
       <w:bCs/>
-      <w:color w:val="4F81BD" w:themeColor="accent1"/>
+      <w:i w:val="0"/>
+      <w:color w:val="000000"/>
+      <w:sz w:val="24"/>
     </w:rPr>
   </w:style>
   <w:style w:type="paragraph" w:styleId="Heading4">

</xml_diff>